<commit_message>
Add revenue heatmap analysis and enhance memo documentation
- Updated the Shine memo to include a revenue-component heatmap and an initial-plan revenue heatmap.
- Added SQL queries for calculating cumulative revenue per revenue company.
- Enhanced the build script to generate new heatmap pages in the memo.
- Revised existing documentation for clarity and accuracy.
</commit_message>
<xml_diff>
--- a/outputs/presentation/Shine_Case_Simple_RAW_3_Page_Memo.docx
+++ b/outputs/presentation/Shine_Case_Simple_RAW_3_Page_Memo.docx
@@ -2579,6 +2579,523 @@
         <w:t>docs/research/SHINE_MARKET_RESEARCH_AND_STRATEGY.md</w:t>
       </w:r>
     </w:p>
+    <w:p>
+      <w:r>
+        <w:br w:type="page"/>
+      </w:r>
+    </w:p>
+    <w:p>
+      <w:pPr>
+        <w:spacing w:after="20"/>
+      </w:pPr>
+      <w:r>
+        <w:rPr>
+          <w:rFonts w:ascii="Arial" w:hAnsi="Arial"/>
+          <w:b/>
+          <w:i w:val="0"/>
+          <w:color w:val="008C8C"/>
+          <w:sz w:val="16"/>
+        </w:rPr>
+        <w:t>PAGE 4 • REVENUE-COMPONENT HEATMAP</w:t>
+      </w:r>
+    </w:p>
+    <w:p>
+      <w:pPr>
+        <w:keepNext/>
+        <w:spacing w:after="30"/>
+      </w:pPr>
+      <w:r>
+        <w:rPr>
+          <w:rFonts w:ascii="Arial" w:hAnsi="Arial"/>
+          <w:b/>
+          <w:i w:val="0"/>
+          <w:color w:val="102A43"/>
+          <w:sz w:val="40"/>
+        </w:rPr>
+        <w:t>BTP combines broad scale with strong cumulative monetization</w:t>
+      </w:r>
+    </w:p>
+    <w:p>
+      <w:pPr>
+        <w:spacing w:after="120"/>
+      </w:pPr>
+      <w:r>
+        <w:rPr>
+          <w:rFonts w:ascii="Arial" w:hAnsi="Arial"/>
+          <w:b w:val="0"/>
+          <w:i w:val="0"/>
+          <w:color w:val="5E6C76"/>
+          <w:sz w:val="17"/>
+        </w:rPr>
+        <w:t>Simple raw-data view • Cumulative through April 2026 • May excluded</w:t>
+      </w:r>
+    </w:p>
+    <w:p>
+      <w:pPr>
+        <w:spacing w:before="40" w:after="40"/>
+        <w:jc w:val="center"/>
+      </w:pPr>
+      <w:r>
+        <w:drawing>
+          <wp:inline xmlns:a="http://schemas.openxmlformats.org/drawingml/2006/main" xmlns:pic="http://schemas.openxmlformats.org/drawingml/2006/picture">
+            <wp:extent cx="6083999" cy="4356946"/>
+            <wp:docPr id="3" name="Picture 3"/>
+            <wp:cNvGraphicFramePr>
+              <a:graphicFrameLocks noChangeAspect="1"/>
+            </wp:cNvGraphicFramePr>
+            <a:graphic>
+              <a:graphicData uri="http://schemas.openxmlformats.org/drawingml/2006/picture">
+                <pic:pic>
+                  <pic:nvPicPr>
+                    <pic:cNvPr id="0" name="simple_raw_revenue_per_company_heatmap.png"/>
+                    <pic:cNvPicPr/>
+                  </pic:nvPicPr>
+                  <pic:blipFill>
+                    <a:blip r:embed="rId12"/>
+                    <a:stretch>
+                      <a:fillRect/>
+                    </a:stretch>
+                  </pic:blipFill>
+                  <pic:spPr>
+                    <a:xfrm>
+                      <a:off x="0" y="0"/>
+                      <a:ext cx="6083999" cy="4356946"/>
+                    </a:xfrm>
+                    <a:prstGeom prst="rect"/>
+                  </pic:spPr>
+                </pic:pic>
+              </a:graphicData>
+            </a:graphic>
+          </wp:inline>
+        </w:drawing>
+      </w:r>
+    </w:p>
+    <w:tbl>
+      <w:tblPr>
+        <w:tblW w:type="auto" w:w="0"/>
+        <w:tblLayout w:type="fixed"/>
+        <w:tblLook w:firstColumn="1" w:firstRow="1" w:lastColumn="0" w:lastRow="0" w:noHBand="0" w:noVBand="1" w:val="04A0"/>
+        <w:tblBorders>
+          <w:top w:val="single" w:sz="7" w:color="FFFFFF"/>
+          <w:left w:val="single" w:sz="7" w:color="FFFFFF"/>
+          <w:bottom w:val="single" w:sz="7" w:color="FFFFFF"/>
+          <w:right w:val="single" w:sz="7" w:color="FFFFFF"/>
+          <w:insideH w:val="single" w:sz="7" w:color="FFFFFF"/>
+          <w:insideV w:val="single" w:sz="7" w:color="FFFFFF"/>
+        </w:tblBorders>
+      </w:tblPr>
+      <w:tblGrid>
+        <w:gridCol w:w="5159"/>
+        <w:gridCol w:w="5159"/>
+      </w:tblGrid>
+      <w:tr>
+        <w:tc>
+          <w:tcPr>
+            <w:tcW w:type="dxa" w:w="5244"/>
+            <w:tcMar>
+              <w:top w:w="85" w:type="dxa"/>
+              <w:start w:w="105" w:type="dxa"/>
+              <w:bottom w:w="85" w:type="dxa"/>
+              <w:end w:w="105" w:type="dxa"/>
+            </w:tcMar>
+            <w:shd w:fill="EAF4F4"/>
+          </w:tcPr>
+          <w:p>
+            <w:pPr>
+              <w:spacing w:after="40" w:line="240" w:lineRule="auto"/>
+            </w:pPr>
+            <w:r>
+              <w:rPr>
+                <w:rFonts w:ascii="Arial" w:hAnsi="Arial"/>
+                <w:b/>
+                <w:i w:val="0"/>
+                <w:color w:val="008C8C"/>
+                <w:sz w:val="17"/>
+              </w:rPr>
+              <w:t>How to read it</w:t>
+            </w:r>
+          </w:p>
+          <w:p>
+            <w:pPr>
+              <w:spacing w:after="40" w:line="240" w:lineRule="auto"/>
+            </w:pPr>
+            <w:r>
+              <w:rPr>
+                <w:rFonts w:ascii="Arial" w:hAnsi="Arial"/>
+                <w:b w:val="0"/>
+                <w:i w:val="0"/>
+                <w:color w:val="17212B"/>
+                <w:sz w:val="15"/>
+              </w:rPr>
+              <w:t>Each coloured cell is the cumulative sum of that revenue component divided by distinct companies with at least one revenue row through April. Darker cells mean more cumulative euros per such company.</w:t>
+            </w:r>
+          </w:p>
+          <w:p>
+            <w:pPr>
+              <w:spacing w:after="40" w:line="240" w:lineRule="auto"/>
+            </w:pPr>
+            <w:r>
+              <w:rPr>
+                <w:rFonts w:ascii="Arial" w:hAnsi="Arial"/>
+                <w:b w:val="0"/>
+                <w:i w:val="0"/>
+                <w:color w:val="17212B"/>
+                <w:sz w:val="15"/>
+              </w:rPr>
+              <w:t>The neutral Total column is the sum of the four components and determines the descending row order. It is deliberately excluded from the colour scale so it does not wash out the component differences.</w:t>
+            </w:r>
+          </w:p>
+          <w:p>
+            <w:pPr>
+              <w:spacing w:after="0" w:line="240" w:lineRule="auto"/>
+            </w:pPr>
+            <w:r>
+              <w:rPr>
+                <w:rFonts w:ascii="Arial" w:hAnsi="Arial"/>
+                <w:b w:val="0"/>
+                <w:i w:val="0"/>
+                <w:color w:val="17212B"/>
+                <w:sz w:val="15"/>
+              </w:rPr>
+              <w:t>Use Page 1 revenue-share bars for segment scale; use this heatmap to compare monetization intensity and identify which revenue types drive it.</w:t>
+            </w:r>
+          </w:p>
+        </w:tc>
+        <w:tc>
+          <w:tcPr>
+            <w:tcW w:type="dxa" w:w="5244"/>
+            <w:tcMar>
+              <w:top w:w="85" w:type="dxa"/>
+              <w:start w:w="105" w:type="dxa"/>
+              <w:bottom w:w="85" w:type="dxa"/>
+              <w:end w:w="105" w:type="dxa"/>
+            </w:tcMar>
+            <w:shd w:fill="F3F5F7"/>
+          </w:tcPr>
+          <w:p>
+            <w:pPr>
+              <w:spacing w:after="40" w:line="240" w:lineRule="auto"/>
+            </w:pPr>
+            <w:r>
+              <w:rPr>
+                <w:rFonts w:ascii="Arial" w:hAnsi="Arial"/>
+                <w:b/>
+                <w:i w:val="0"/>
+                <w:color w:val="C95C3D"/>
+                <w:sz w:val="17"/>
+              </w:rPr>
+              <w:t>Limitations</w:t>
+            </w:r>
+          </w:p>
+          <w:p>
+            <w:pPr>
+              <w:spacing w:after="40" w:line="240" w:lineRule="auto"/>
+            </w:pPr>
+            <w:r>
+              <w:rPr>
+                <w:rFonts w:ascii="Arial" w:hAnsi="Arial"/>
+                <w:b w:val="0"/>
+                <w:i w:val="0"/>
+                <w:color w:val="17212B"/>
+                <w:sz w:val="15"/>
+              </w:rPr>
+              <w:t>This is cumulative revenue per revenue company, not a monthly average. Older companies have had more months to accumulate revenue, so tenure can influence the ranking.</w:t>
+            </w:r>
+          </w:p>
+          <w:p>
+            <w:pPr>
+              <w:spacing w:after="0" w:line="240" w:lineRule="auto"/>
+            </w:pPr>
+            <w:r>
+              <w:rPr>
+                <w:rFonts w:ascii="Arial" w:hAnsi="Arial"/>
+                <w:b w:val="0"/>
+                <w:i w:val="0"/>
+                <w:color w:val="17212B"/>
+                <w:sz w:val="15"/>
+              </w:rPr>
+              <w:t>The inner join excludes companies with no revenue row. Small personas can also be volatile—especially Repair Installation (n=38). Revenue is not profit and does not prove that persona membership caused performance.</w:t>
+            </w:r>
+          </w:p>
+        </w:tc>
+      </w:tr>
+    </w:tbl>
+    <w:p>
+      <w:pPr>
+        <w:spacing w:before="60" w:after="0"/>
+      </w:pPr>
+      <w:r>
+        <w:rPr>
+          <w:rFonts w:ascii="Arial" w:hAnsi="Arial"/>
+          <w:b/>
+          <w:i w:val="0"/>
+          <w:color w:val="008C8C"/>
+          <w:sz w:val="15"/>
+        </w:rPr>
+        <w:t xml:space="preserve">Reproducible SQL: </w:t>
+      </w:r>
+      <w:r>
+        <w:rPr>
+          <w:rFonts w:ascii="Arial" w:hAnsi="Arial"/>
+          <w:b w:val="0"/>
+          <w:i w:val="0"/>
+          <w:color w:val="17212B"/>
+          <w:sz w:val="15"/>
+        </w:rPr>
+        <w:t>Query 9 in sql/simple_raw_memo_queries.sql</w:t>
+      </w:r>
+    </w:p>
+    <w:p>
+      <w:r>
+        <w:br w:type="page"/>
+      </w:r>
+    </w:p>
+    <w:p>
+      <w:pPr>
+        <w:spacing w:after="20"/>
+      </w:pPr>
+      <w:r>
+        <w:rPr>
+          <w:rFonts w:ascii="Arial" w:hAnsi="Arial"/>
+          <w:b/>
+          <w:i w:val="0"/>
+          <w:color w:val="008C8C"/>
+          <w:sz w:val="16"/>
+        </w:rPr>
+        <w:t>PAGE 5 • INITIAL-PLAN REVENUE HEATMAP</w:t>
+      </w:r>
+    </w:p>
+    <w:p>
+      <w:pPr>
+        <w:keepNext/>
+        <w:spacing w:after="30"/>
+      </w:pPr>
+      <w:r>
+        <w:rPr>
+          <w:rFonts w:ascii="Arial" w:hAnsi="Arial"/>
+          <w:b/>
+          <w:i w:val="0"/>
+          <w:color w:val="102A43"/>
+          <w:sz w:val="40"/>
+        </w:rPr>
+        <w:t>Business has the highest cumulative revenue per revenue company—but limited scale</w:t>
+      </w:r>
+    </w:p>
+    <w:p>
+      <w:pPr>
+        <w:spacing w:after="120"/>
+      </w:pPr>
+      <w:r>
+        <w:rPr>
+          <w:rFonts w:ascii="Arial" w:hAnsi="Arial"/>
+          <w:b w:val="0"/>
+          <w:i w:val="0"/>
+          <w:color w:val="5E6C76"/>
+          <w:sz w:val="17"/>
+        </w:rPr>
+        <w:t>Simple raw-data view • Initial plan, not necessarily current plan • May excluded</w:t>
+      </w:r>
+    </w:p>
+    <w:p>
+      <w:pPr>
+        <w:spacing w:before="40" w:after="80"/>
+        <w:jc w:val="center"/>
+      </w:pPr>
+      <w:r>
+        <w:drawing>
+          <wp:inline xmlns:a="http://schemas.openxmlformats.org/drawingml/2006/main" xmlns:pic="http://schemas.openxmlformats.org/drawingml/2006/picture">
+            <wp:extent cx="6083999" cy="2588762"/>
+            <wp:docPr id="4" name="Picture 4"/>
+            <wp:cNvGraphicFramePr>
+              <a:graphicFrameLocks noChangeAspect="1"/>
+            </wp:cNvGraphicFramePr>
+            <a:graphic>
+              <a:graphicData uri="http://schemas.openxmlformats.org/drawingml/2006/picture">
+                <pic:pic>
+                  <pic:nvPicPr>
+                    <pic:cNvPr id="0" name="simple_raw_plan_revenue_per_company_heatmap.png"/>
+                    <pic:cNvPicPr/>
+                  </pic:nvPicPr>
+                  <pic:blipFill>
+                    <a:blip r:embed="rId13"/>
+                    <a:stretch>
+                      <a:fillRect/>
+                    </a:stretch>
+                  </pic:blipFill>
+                  <pic:spPr>
+                    <a:xfrm>
+                      <a:off x="0" y="0"/>
+                      <a:ext cx="6083999" cy="2588762"/>
+                    </a:xfrm>
+                    <a:prstGeom prst="rect"/>
+                  </pic:spPr>
+                </pic:pic>
+              </a:graphicData>
+            </a:graphic>
+          </wp:inline>
+        </w:drawing>
+      </w:r>
+    </w:p>
+    <w:tbl>
+      <w:tblPr>
+        <w:tblW w:type="auto" w:w="0"/>
+        <w:tblLayout w:type="fixed"/>
+        <w:tblLook w:firstColumn="1" w:firstRow="1" w:lastColumn="0" w:lastRow="0" w:noHBand="0" w:noVBand="1" w:val="04A0"/>
+        <w:tblBorders>
+          <w:top w:val="single" w:sz="7" w:color="FFFFFF"/>
+          <w:left w:val="single" w:sz="7" w:color="FFFFFF"/>
+          <w:bottom w:val="single" w:sz="7" w:color="FFFFFF"/>
+          <w:right w:val="single" w:sz="7" w:color="FFFFFF"/>
+          <w:insideH w:val="single" w:sz="7" w:color="FFFFFF"/>
+          <w:insideV w:val="single" w:sz="7" w:color="FFFFFF"/>
+        </w:tblBorders>
+      </w:tblPr>
+      <w:tblGrid>
+        <w:gridCol w:w="5159"/>
+        <w:gridCol w:w="5159"/>
+      </w:tblGrid>
+      <w:tr>
+        <w:tc>
+          <w:tcPr>
+            <w:tcW w:type="dxa" w:w="5244"/>
+            <w:tcMar>
+              <w:top w:w="90" w:type="dxa"/>
+              <w:start w:w="105" w:type="dxa"/>
+              <w:bottom w:w="90" w:type="dxa"/>
+              <w:end w:w="105" w:type="dxa"/>
+            </w:tcMar>
+            <w:shd w:fill="EAF4F4"/>
+          </w:tcPr>
+          <w:p>
+            <w:pPr>
+              <w:spacing w:after="40" w:line="240" w:lineRule="auto"/>
+            </w:pPr>
+            <w:r>
+              <w:rPr>
+                <w:rFonts w:ascii="Arial" w:hAnsi="Arial"/>
+                <w:b/>
+                <w:i w:val="0"/>
+                <w:color w:val="008C8C"/>
+                <w:sz w:val="17"/>
+              </w:rPr>
+              <w:t>How to read it</w:t>
+            </w:r>
+          </w:p>
+          <w:p>
+            <w:pPr>
+              <w:spacing w:after="40" w:line="240" w:lineRule="auto"/>
+            </w:pPr>
+            <w:r>
+              <w:rPr>
+                <w:rFonts w:ascii="Arial" w:hAnsi="Arial"/>
+                <w:b w:val="0"/>
+                <w:i w:val="0"/>
+                <w:color w:val="17212B"/>
+                <w:sz w:val="15"/>
+              </w:rPr>
+              <w:t>Each coloured cell is cumulative component revenue divided by distinct revenue companies in that initial plan. The neutral Total column sums the four components and sets the descending row order.</w:t>
+            </w:r>
+          </w:p>
+          <w:p>
+            <w:pPr>
+              <w:spacing w:after="0" w:line="240" w:lineRule="auto"/>
+            </w:pPr>
+            <w:r>
+              <w:rPr>
+                <w:rFonts w:ascii="Arial" w:hAnsi="Arial"/>
+                <w:b w:val="0"/>
+                <w:i w:val="0"/>
+                <w:color w:val="17212B"/>
+                <w:sz w:val="15"/>
+              </w:rPr>
+              <w:t>Total is excluded from the colour scale. Company count (n) provides the scale check: a high per-company value in a small group is not automatically the largest opportunity.</w:t>
+            </w:r>
+          </w:p>
+        </w:tc>
+        <w:tc>
+          <w:tcPr>
+            <w:tcW w:type="dxa" w:w="5244"/>
+            <w:tcMar>
+              <w:top w:w="90" w:type="dxa"/>
+              <w:start w:w="105" w:type="dxa"/>
+              <w:bottom w:w="90" w:type="dxa"/>
+              <w:end w:w="105" w:type="dxa"/>
+            </w:tcMar>
+            <w:shd w:fill="F3F5F7"/>
+          </w:tcPr>
+          <w:p>
+            <w:pPr>
+              <w:spacing w:after="40" w:line="240" w:lineRule="auto"/>
+            </w:pPr>
+            <w:r>
+              <w:rPr>
+                <w:rFonts w:ascii="Arial" w:hAnsi="Arial"/>
+                <w:b/>
+                <w:i w:val="0"/>
+                <w:color w:val="C95C3D"/>
+                <w:sz w:val="17"/>
+              </w:rPr>
+              <w:t>Limitations</w:t>
+            </w:r>
+          </w:p>
+          <w:p>
+            <w:pPr>
+              <w:spacing w:after="40" w:line="240" w:lineRule="auto"/>
+            </w:pPr>
+            <w:r>
+              <w:rPr>
+                <w:rFonts w:ascii="Arial" w:hAnsi="Arial"/>
+                <w:b w:val="0"/>
+                <w:i w:val="0"/>
+                <w:color w:val="17212B"/>
+                <w:sz w:val="15"/>
+              </w:rPr>
+              <w:t>The field records the initial subscription group and may not represent the current plan. Differences may reflect company age, selection, size, or behaviour—not a causal effect of the plan.</w:t>
+            </w:r>
+          </w:p>
+          <w:p>
+            <w:pPr>
+              <w:spacing w:after="0" w:line="240" w:lineRule="auto"/>
+            </w:pPr>
+            <w:r>
+              <w:rPr>
+                <w:rFonts w:ascii="Arial" w:hAnsi="Arial"/>
+                <w:b w:val="0"/>
+                <w:i w:val="0"/>
+                <w:color w:val="17212B"/>
+                <w:sz w:val="15"/>
+              </w:rPr>
+              <w:t>Values are cumulative, so older companies have more exposure. The inner join also excludes companies with no revenue row. This cannot justify an upsell without current-plan, migration, margin, and experiment data.</w:t>
+            </w:r>
+          </w:p>
+        </w:tc>
+      </w:tr>
+    </w:tbl>
+    <w:p>
+      <w:pPr>
+        <w:spacing w:before="80" w:after="0"/>
+      </w:pPr>
+      <w:r>
+        <w:rPr>
+          <w:rFonts w:ascii="Arial" w:hAnsi="Arial"/>
+          <w:b/>
+          <w:i w:val="0"/>
+          <w:color w:val="008C8C"/>
+          <w:sz w:val="15"/>
+        </w:rPr>
+        <w:t xml:space="preserve">Reproducible SQL: </w:t>
+      </w:r>
+      <w:r>
+        <w:rPr>
+          <w:rFonts w:ascii="Arial" w:hAnsi="Arial"/>
+          <w:b w:val="0"/>
+          <w:i w:val="0"/>
+          <w:color w:val="17212B"/>
+          <w:sz w:val="15"/>
+        </w:rPr>
+        <w:t>Query 10 in sql/simple_raw_memo_queries.sql</w:t>
+      </w:r>
+    </w:p>
     <w:sectPr>
       <w:footerReference w:type="default" r:id="rId9"/>
       <w:pgSz w:w="11906" w:h="16838"/>

</xml_diff>

<commit_message>
Add SQL script for full-period revenue-health classification using two case tables
- Implemented a comprehensive analysis of company revenue health based on activation and revenue data.
- Defined parameters for analysis including date ranges and thresholds for revenue decline.
- Created multiple CTEs to generate a monthly revenue spine, calculate historical metrics, and classify account health states.
- Aggregated results to provide insights on company performance over time, including fixed cohort trends.
</commit_message>
<xml_diff>
--- a/outputs/presentation/Shine_Case_Simple_RAW_3_Page_Memo.docx
+++ b/outputs/presentation/Shine_Case_Simple_RAW_3_Page_Memo.docx
@@ -3096,6 +3096,460 @@
         <w:t>Query 10 in sql/simple_raw_memo_queries.sql</w:t>
       </w:r>
     </w:p>
+    <w:p>
+      <w:r>
+        <w:br w:type="page"/>
+      </w:r>
+    </w:p>
+    <w:p>
+      <w:pPr>
+        <w:spacing w:after="20"/>
+      </w:pPr>
+      <w:r>
+        <w:rPr>
+          <w:rFonts w:ascii="Arial" w:hAnsi="Arial"/>
+          <w:b/>
+          <w:i w:val="0"/>
+          <w:color w:val="008C8C"/>
+          <w:sz w:val="16"/>
+        </w:rPr>
+        <w:t>PAGE 6 • REVENUE-BASED ACCOUNT HEALTH</w:t>
+      </w:r>
+    </w:p>
+    <w:p>
+      <w:pPr>
+        <w:keepNext/>
+        <w:spacing w:after="30"/>
+      </w:pPr>
+      <w:r>
+        <w:rPr>
+          <w:rFonts w:ascii="Arial" w:hAnsi="Arial"/>
+          <w:b/>
+          <w:i w:val="0"/>
+          <w:color w:val="102A43"/>
+          <w:sz w:val="40"/>
+        </w:rPr>
+        <w:t>Health is broadly stable, but Business and several personas show fragility</w:t>
+      </w:r>
+    </w:p>
+    <w:p>
+      <w:pPr>
+        <w:spacing w:after="120"/>
+      </w:pPr>
+      <w:r>
+        <w:rPr>
+          <w:rFonts w:ascii="Arial" w:hAnsi="Arial"/>
+          <w:b w:val="0"/>
+          <w:i w:val="0"/>
+          <w:color w:val="5E6C76"/>
+          <w:sz w:val="17"/>
+        </w:rPr>
+        <w:t>Advanced method • Inputs limited to companies + revenue_with_total • May excluded</w:t>
+      </w:r>
+    </w:p>
+    <w:tbl>
+      <w:tblPr>
+        <w:tblW w:type="auto" w:w="0"/>
+        <w:tblLayout w:type="fixed"/>
+        <w:tblLook w:firstColumn="1" w:firstRow="1" w:lastColumn="0" w:lastRow="0" w:noHBand="0" w:noVBand="1" w:val="04A0"/>
+        <w:tblBorders>
+          <w:top w:val="single" w:sz="8" w:color="FFFFFF"/>
+          <w:left w:val="single" w:sz="8" w:color="FFFFFF"/>
+          <w:bottom w:val="single" w:sz="8" w:color="FFFFFF"/>
+          <w:right w:val="single" w:sz="8" w:color="FFFFFF"/>
+          <w:insideH w:val="single" w:sz="8" w:color="FFFFFF"/>
+          <w:insideV w:val="single" w:sz="8" w:color="FFFFFF"/>
+        </w:tblBorders>
+      </w:tblPr>
+      <w:tblGrid>
+        <w:gridCol w:w="2622"/>
+        <w:gridCol w:w="2622"/>
+        <w:gridCol w:w="2622"/>
+        <w:gridCol w:w="2622"/>
+      </w:tblGrid>
+      <w:tr>
+        <w:tc>
+          <w:tcPr>
+            <w:tcW w:type="dxa" w:w="2622"/>
+            <w:shd w:fill="F3F5F7"/>
+            <w:tcMar>
+              <w:top w:w="90" w:type="dxa"/>
+              <w:start w:w="65" w:type="dxa"/>
+              <w:bottom w:w="90" w:type="dxa"/>
+              <w:end w:w="65" w:type="dxa"/>
+            </w:tcMar>
+            <w:vAlign w:val="center"/>
+          </w:tcPr>
+          <w:p>
+            <w:pPr>
+              <w:spacing w:after="0"/>
+              <w:jc w:val="center"/>
+            </w:pPr>
+            <w:r>
+              <w:rPr>
+                <w:rFonts w:ascii="Arial" w:hAnsi="Arial"/>
+                <w:b/>
+                <w:i w:val="0"/>
+                <w:color w:val="008C8C"/>
+                <w:sz w:val="30"/>
+              </w:rPr>
+              <w:t>74.7%</w:t>
+            </w:r>
+          </w:p>
+          <w:p>
+            <w:pPr>
+              <w:spacing w:after="0"/>
+              <w:jc w:val="center"/>
+            </w:pPr>
+            <w:r>
+              <w:rPr>
+                <w:rFonts w:ascii="Arial" w:hAnsi="Arial"/>
+                <w:b w:val="0"/>
+                <w:i w:val="0"/>
+                <w:color w:val="5E6C76"/>
+                <w:sz w:val="15"/>
+              </w:rPr>
+              <w:t>Healthy in April</w:t>
+            </w:r>
+          </w:p>
+        </w:tc>
+        <w:tc>
+          <w:tcPr>
+            <w:tcW w:type="dxa" w:w="2622"/>
+            <w:shd w:fill="EAF4F4"/>
+            <w:tcMar>
+              <w:top w:w="90" w:type="dxa"/>
+              <w:start w:w="65" w:type="dxa"/>
+              <w:bottom w:w="90" w:type="dxa"/>
+              <w:end w:w="65" w:type="dxa"/>
+            </w:tcMar>
+            <w:vAlign w:val="center"/>
+          </w:tcPr>
+          <w:p>
+            <w:pPr>
+              <w:spacing w:after="0"/>
+              <w:jc w:val="center"/>
+            </w:pPr>
+            <w:r>
+              <w:rPr>
+                <w:rFonts w:ascii="Arial" w:hAnsi="Arial"/>
+                <w:b/>
+                <w:i w:val="0"/>
+                <w:color w:val="008C8C"/>
+                <w:sz w:val="30"/>
+              </w:rPr>
+              <w:t>10.6%</w:t>
+            </w:r>
+          </w:p>
+          <w:p>
+            <w:pPr>
+              <w:spacing w:after="0"/>
+              <w:jc w:val="center"/>
+            </w:pPr>
+            <w:r>
+              <w:rPr>
+                <w:rFonts w:ascii="Arial" w:hAnsi="Arial"/>
+                <w:b w:val="0"/>
+                <w:i w:val="0"/>
+                <w:color w:val="5E6C76"/>
+                <w:sz w:val="15"/>
+              </w:rPr>
+              <w:t>Watch in April</w:t>
+            </w:r>
+          </w:p>
+        </w:tc>
+        <w:tc>
+          <w:tcPr>
+            <w:tcW w:type="dxa" w:w="2622"/>
+            <w:shd w:fill="F3F5F7"/>
+            <w:tcMar>
+              <w:top w:w="90" w:type="dxa"/>
+              <w:start w:w="65" w:type="dxa"/>
+              <w:bottom w:w="90" w:type="dxa"/>
+              <w:end w:w="65" w:type="dxa"/>
+            </w:tcMar>
+            <w:vAlign w:val="center"/>
+          </w:tcPr>
+          <w:p>
+            <w:pPr>
+              <w:spacing w:after="0"/>
+              <w:jc w:val="center"/>
+            </w:pPr>
+            <w:r>
+              <w:rPr>
+                <w:rFonts w:ascii="Arial" w:hAnsi="Arial"/>
+                <w:b/>
+                <w:i w:val="0"/>
+                <w:color w:val="008C8C"/>
+                <w:sz w:val="30"/>
+              </w:rPr>
+              <w:t>12.9%</w:t>
+            </w:r>
+          </w:p>
+          <w:p>
+            <w:pPr>
+              <w:spacing w:after="0"/>
+              <w:jc w:val="center"/>
+            </w:pPr>
+            <w:r>
+              <w:rPr>
+                <w:rFonts w:ascii="Arial" w:hAnsi="Arial"/>
+                <w:b w:val="0"/>
+                <w:i w:val="0"/>
+                <w:color w:val="5E6C76"/>
+                <w:sz w:val="15"/>
+              </w:rPr>
+              <w:t>At-risk + churn proxy</w:t>
+            </w:r>
+          </w:p>
+        </w:tc>
+        <w:tc>
+          <w:tcPr>
+            <w:tcW w:type="dxa" w:w="2622"/>
+            <w:shd w:fill="EAF4F4"/>
+            <w:tcMar>
+              <w:top w:w="90" w:type="dxa"/>
+              <w:start w:w="65" w:type="dxa"/>
+              <w:bottom w:w="90" w:type="dxa"/>
+              <w:end w:w="65" w:type="dxa"/>
+            </w:tcMar>
+            <w:vAlign w:val="center"/>
+          </w:tcPr>
+          <w:p>
+            <w:pPr>
+              <w:spacing w:after="0"/>
+              <w:jc w:val="center"/>
+            </w:pPr>
+            <w:r>
+              <w:rPr>
+                <w:rFonts w:ascii="Arial" w:hAnsi="Arial"/>
+                <w:b/>
+                <w:i w:val="0"/>
+                <w:color w:val="008C8C"/>
+                <w:sz w:val="30"/>
+              </w:rPr>
+              <w:t>6,337</w:t>
+            </w:r>
+          </w:p>
+          <w:p>
+            <w:pPr>
+              <w:spacing w:after="0"/>
+              <w:jc w:val="center"/>
+            </w:pPr>
+            <w:r>
+              <w:rPr>
+                <w:rFonts w:ascii="Arial" w:hAnsi="Arial"/>
+                <w:b w:val="0"/>
+                <w:i w:val="0"/>
+                <w:color w:val="5E6C76"/>
+                <w:sz w:val="15"/>
+              </w:rPr>
+              <w:t>comparable mature companies</w:t>
+            </w:r>
+          </w:p>
+        </w:tc>
+      </w:tr>
+    </w:tbl>
+    <w:p>
+      <w:pPr>
+        <w:spacing w:before="60" w:after="40"/>
+        <w:jc w:val="center"/>
+      </w:pPr>
+      <w:r>
+        <w:drawing>
+          <wp:inline xmlns:a="http://schemas.openxmlformats.org/drawingml/2006/main" xmlns:pic="http://schemas.openxmlformats.org/drawingml/2006/picture">
+            <wp:extent cx="6300000" cy="4342614"/>
+            <wp:docPr id="5" name="Picture 5"/>
+            <wp:cNvGraphicFramePr>
+              <a:graphicFrameLocks noChangeAspect="1"/>
+            </wp:cNvGraphicFramePr>
+            <a:graphic>
+              <a:graphicData uri="http://schemas.openxmlformats.org/drawingml/2006/picture">
+                <pic:pic>
+                  <pic:nvPicPr>
+                    <pic:cNvPr id="0" name="raw_two_table_health_full_period.png"/>
+                    <pic:cNvPicPr/>
+                  </pic:nvPicPr>
+                  <pic:blipFill>
+                    <a:blip r:embed="rId14"/>
+                    <a:stretch>
+                      <a:fillRect/>
+                    </a:stretch>
+                  </pic:blipFill>
+                  <pic:spPr>
+                    <a:xfrm>
+                      <a:off x="0" y="0"/>
+                      <a:ext cx="6300000" cy="4342614"/>
+                    </a:xfrm>
+                    <a:prstGeom prst="rect"/>
+                  </pic:spPr>
+                </pic:pic>
+              </a:graphicData>
+            </a:graphic>
+          </wp:inline>
+        </w:drawing>
+      </w:r>
+    </w:p>
+    <w:tbl>
+      <w:tblPr>
+        <w:tblW w:type="auto" w:w="0"/>
+        <w:tblLayout w:type="fixed"/>
+        <w:tblLook w:firstColumn="1" w:firstRow="1" w:lastColumn="0" w:lastRow="0" w:noHBand="0" w:noVBand="1" w:val="04A0"/>
+        <w:tblBorders>
+          <w:top w:val="single" w:sz="7" w:color="FFFFFF"/>
+          <w:left w:val="single" w:sz="7" w:color="FFFFFF"/>
+          <w:bottom w:val="single" w:sz="7" w:color="FFFFFF"/>
+          <w:right w:val="single" w:sz="7" w:color="FFFFFF"/>
+          <w:insideH w:val="single" w:sz="7" w:color="FFFFFF"/>
+          <w:insideV w:val="single" w:sz="7" w:color="FFFFFF"/>
+        </w:tblBorders>
+      </w:tblPr>
+      <w:tblGrid>
+        <w:gridCol w:w="5159"/>
+        <w:gridCol w:w="5159"/>
+      </w:tblGrid>
+      <w:tr>
+        <w:tc>
+          <w:tcPr>
+            <w:tcW w:type="dxa" w:w="5244"/>
+            <w:tcMar>
+              <w:top w:w="78" w:type="dxa"/>
+              <w:start w:w="100" w:type="dxa"/>
+              <w:bottom w:w="78" w:type="dxa"/>
+              <w:end w:w="100" w:type="dxa"/>
+            </w:tcMar>
+            <w:shd w:fill="EAF4F4"/>
+          </w:tcPr>
+          <w:p>
+            <w:pPr>
+              <w:spacing w:after="40" w:line="240" w:lineRule="auto"/>
+            </w:pPr>
+            <w:r>
+              <w:rPr>
+                <w:rFonts w:ascii="Arial" w:hAnsi="Arial"/>
+                <w:b/>
+                <w:i w:val="0"/>
+                <w:color w:val="008C8C"/>
+                <w:sz w:val="16"/>
+              </w:rPr>
+              <w:t>Definitions</w:t>
+            </w:r>
+          </w:p>
+          <w:p>
+            <w:pPr>
+              <w:spacing w:after="40" w:line="240" w:lineRule="auto"/>
+            </w:pPr>
+            <w:r>
+              <w:rPr>
+                <w:rFonts w:ascii="Arial" w:hAnsi="Arial"/>
+                <w:b w:val="0"/>
+                <w:i w:val="0"/>
+                <w:color w:val="17212B"/>
+                <w:sz w:val="14"/>
+              </w:rPr>
+              <w:t>Healthy: revenue-active, no earlier observed revenue gap, and no material decline. Watch: still active, but at least 30% and €10 below the prior three-month median.</w:t>
+            </w:r>
+          </w:p>
+          <w:p>
+            <w:pPr>
+              <w:spacing w:after="0" w:line="240" w:lineRule="auto"/>
+            </w:pPr>
+            <w:r>
+              <w:rPr>
+                <w:rFonts w:ascii="Arial" w:hAnsi="Arial"/>
+                <w:b w:val="0"/>
+                <w:i w:val="0"/>
+                <w:color w:val="17212B"/>
+                <w:sz w:val="14"/>
+              </w:rPr>
+              <w:t>Recovered: active after an observed gap. At-risk: absent for 1–2 months. Churned proxy: absent for 3+ months. Never monetized: no revenue observed to date.</w:t>
+            </w:r>
+          </w:p>
+        </w:tc>
+        <w:tc>
+          <w:tcPr>
+            <w:tcW w:type="dxa" w:w="5244"/>
+            <w:tcMar>
+              <w:top w:w="78" w:type="dxa"/>
+              <w:start w:w="100" w:type="dxa"/>
+              <w:bottom w:w="78" w:type="dxa"/>
+              <w:end w:w="100" w:type="dxa"/>
+            </w:tcMar>
+            <w:shd w:fill="F3F5F7"/>
+          </w:tcPr>
+          <w:p>
+            <w:pPr>
+              <w:spacing w:after="40" w:line="240" w:lineRule="auto"/>
+            </w:pPr>
+            <w:r>
+              <w:rPr>
+                <w:rFonts w:ascii="Arial" w:hAnsi="Arial"/>
+                <w:b/>
+                <w:i w:val="0"/>
+                <w:color w:val="C95C3D"/>
+                <w:sz w:val="16"/>
+              </w:rPr>
+              <w:t>Interpretation limits</w:t>
+            </w:r>
+          </w:p>
+          <w:p>
+            <w:pPr>
+              <w:spacing w:after="40" w:line="240" w:lineRule="auto"/>
+            </w:pPr>
+            <w:r>
+              <w:rPr>
+                <w:rFonts w:ascii="Arial" w:hAnsi="Arial"/>
+                <w:b w:val="0"/>
+                <w:i w:val="0"/>
+                <w:color w:val="17212B"/>
+                <w:sz w:val="14"/>
+              </w:rPr>
+              <w:t>This is revenue health—not product use, satisfaction, profitability, account status, or confirmed cancellation. A missing row is assumed to mean no observed revenue and must be validated.</w:t>
+            </w:r>
+          </w:p>
+          <w:p>
+            <w:pPr>
+              <w:spacing w:after="0" w:line="240" w:lineRule="auto"/>
+            </w:pPr>
+            <w:r>
+              <w:rPr>
+                <w:rFonts w:ascii="Arial" w:hAnsi="Arial"/>
+                <w:b w:val="0"/>
+                <w:i w:val="0"/>
+                <w:color w:val="17212B"/>
+                <w:sz w:val="14"/>
+              </w:rPr>
+              <w:t>Only February–April have three complete post-activation baseline months. The trend uses a fixed October cohort; the April cuts use all mature cohorts. Activation-month exposure is partial and initial plan may not be current.</w:t>
+            </w:r>
+          </w:p>
+        </w:tc>
+      </w:tr>
+    </w:tbl>
+    <w:p>
+      <w:pPr>
+        <w:spacing w:before="60" w:after="0"/>
+      </w:pPr>
+      <w:r>
+        <w:rPr>
+          <w:rFonts w:ascii="Arial" w:hAnsi="Arial"/>
+          <w:b/>
+          <w:i w:val="0"/>
+          <w:color w:val="008C8C"/>
+          <w:sz w:val="15"/>
+        </w:rPr>
+        <w:t xml:space="preserve">Self-contained SQL: </w:t>
+      </w:r>
+      <w:r>
+        <w:rPr>
+          <w:rFonts w:ascii="Arial" w:hAnsi="Arial"/>
+          <w:b w:val="0"/>
+          <w:i w:val="0"/>
+          <w:color w:val="17212B"/>
+          <w:sz w:val="15"/>
+        </w:rPr>
+        <w:t>sql/raw_two_table_health_analysis.sql — reads only companies and revenue_with_total</w:t>
+      </w:r>
+    </w:p>
     <w:sectPr>
       <w:footerReference w:type="default" r:id="rId9"/>
       <w:pgSz w:w="11906" w:h="16838"/>

</xml_diff>